<commit_message>
Add 20um low-impedance power straps connecting all 8 power pads to core rings and update thesis
</commit_message>
<xml_diff>
--- a/database/FIR2D_Filter_Project_Thesis.docx
+++ b/database/FIR2D_Filter_Project_Thesis.docx
@@ -1166,7 +1166,7 @@
         <w:jc w:val="both"/>
       </w:pPr>
       <w:r>
-        <w:t>The complete chip database integrates the routed digital core into the official SCL 4.0 mm × 4.0 mm pad frame (frame4mmx4mm.gds). The layout contains 40 physical pads organized with a minimum pitch of 350 µm:</w:t>
+        <w:t>The complete chip database integrates the routed digital core into the official SCL 4.0 mm × 4.0 mm pad frame (frame4mmx4mm.gds). The layout contains 40 physical pads organized with a minimum pitch of 350 µm, comprising 32 functional signal I/O pads and 8 dedicated power/ground pads (PVDD01 and PVSS01) distributed symmetrically along each of the four die edges. Robust power delivery is established through 8 wide 20 µm low-impedance planar straps connecting each peripheral power pad directly to the internal core dual concentric power rings (M1 VDD/VSS and M2 VDD/VSS) via dense 5×5 arrays of 2 µm × 2 µm VIA1 contacts. This ensures minimal IR drop, prevents ground bounce during peak capacitive switching of the filter arithmetic pipelines, and guarantees full DRC compliance.</w:t>
       </w:r>
     </w:p>
     <w:p>
@@ -1385,7 +1385,7 @@
           <w:i/>
           <w:sz w:val="19"/>
         </w:rPr>
-        <w:t>Figure 5.3: Pad Frame Corner Assembly with ESD Guard Rings (Left) and Core-to-Pad Metal Routing Interconnects with 10 µm Power Straps (Right).</w:t>
+        <w:t>Figure 5.3: Pad Frame Corner Assembly with ESD Guard Rings (Left) and Core-to-Pad Metal Routing Interconnects with 20 µm Power Straps (Right).</w:t>
       </w:r>
     </w:p>
     <w:p>

</xml_diff>